<commit_message>
Update Deepstone skill to v1.1.1
</commit_message>
<xml_diff>
--- a/.agents/skills/deepstone-design-language/assets/templates/deepstone-starter.docx
+++ b/.agents/skills/deepstone-design-language/assets/templates/deepstone-starter.docx
@@ -74,7 +74,7 @@
             </w:pPr>
             <w:r>
               <w:rPr>
-                <w:rFonts w:ascii="EB Garamond" w:hAnsi="EB Garamond" w:eastAsia="Swei B2 Serif CJKtc"/>
+                <w:rFonts w:ascii="EB Garamond" w:hAnsi="EB Garamond" w:eastAsia="Swei B2 Serif CJKtc" w:cs="EB Garamond"/>
                 <w:b/>
                 <w:color w:val="FFFFFF"/>
                 <w:sz w:val="58"/>
@@ -91,7 +91,7 @@
             </w:pPr>
             <w:r>
               <w:rPr>
-                <w:rFonts w:ascii="EB Garamond" w:hAnsi="EB Garamond" w:eastAsia="Swei B2 Serif CJKtc"/>
+                <w:rFonts w:ascii="EB Garamond" w:hAnsi="EB Garamond" w:eastAsia="Swei B2 Serif CJKtc" w:cs="EB Garamond"/>
                 <w:color w:val="D8D8E2"/>
                 <w:sz w:val="23"/>
               </w:rPr>
@@ -108,7 +108,7 @@
       </w:pPr>
       <w:r>
         <w:rPr>
-          <w:rFonts w:ascii="EB Garamond" w:hAnsi="EB Garamond" w:eastAsia="Swei B2 Serif CJKtc"/>
+          <w:rFonts w:ascii="EB Garamond" w:hAnsi="EB Garamond" w:eastAsia="Swei B2 Serif CJKtc" w:cs="EB Garamond"/>
           <w:b w:val="0"/>
           <w:color w:val="0A0A1E"/>
           <w:sz w:val="21"/>
@@ -122,7 +122,7 @@
       </w:pPr>
       <w:r>
         <w:rPr>
-          <w:rFonts w:ascii="EB Garamond" w:hAnsi="EB Garamond" w:eastAsia="Swei B2 Serif CJKtc"/>
+          <w:rFonts w:ascii="EB Garamond" w:hAnsi="EB Garamond" w:eastAsia="Swei B2 Serif CJKtc" w:cs="EB Garamond"/>
           <w:b/>
           <w:color w:val="094197"/>
           <w:sz w:val="17"/>
@@ -137,7 +137,7 @@
       </w:pPr>
       <w:r>
         <w:rPr>
-          <w:rFonts w:ascii="EB Garamond" w:hAnsi="EB Garamond" w:eastAsia="Swei B2 Serif CJKtc"/>
+          <w:rFonts w:ascii="EB Garamond" w:hAnsi="EB Garamond" w:eastAsia="Swei B2 Serif CJKtc" w:cs="EB Garamond"/>
           <w:b w:val="0"/>
           <w:color w:val="0A0A1E"/>
           <w:sz w:val="28"/>
@@ -152,7 +152,7 @@
       </w:pPr>
       <w:r>
         <w:rPr>
-          <w:rFonts w:ascii="EB Garamond" w:hAnsi="EB Garamond" w:eastAsia="Swei B2 Serif CJKtc"/>
+          <w:rFonts w:ascii="EB Garamond" w:hAnsi="EB Garamond" w:eastAsia="Swei B2 Serif CJKtc" w:cs="EB Garamond"/>
           <w:b w:val="0"/>
           <w:color w:val="525267"/>
           <w:sz w:val="19"/>
@@ -213,7 +213,7 @@
       </w:pPr>
       <w:r>
         <w:rPr>
-          <w:rFonts w:ascii="EB Garamond" w:hAnsi="EB Garamond" w:eastAsia="Swei B2 Serif CJKtc"/>
+          <w:rFonts w:ascii="EB Garamond" w:hAnsi="EB Garamond" w:eastAsia="Swei B2 Serif CJKtc" w:cs="EB Garamond"/>
           <w:b/>
           <w:color w:val="404082"/>
           <w:sz w:val="17"/>
@@ -226,6 +226,12 @@
         <w:pStyle w:val="Heading1"/>
       </w:pPr>
       <w:r>
+        <w:rPr>
+          <w:rFonts w:ascii="EB Garamond" w:hAnsi="EB Garamond" w:eastAsia="Swei B2 Serif CJKtc" w:cs="EB Garamond"/>
+          <w:b/>
+          <w:color w:val="0A0A1E"/>
+          <w:sz w:val="44"/>
+        </w:rPr>
         <w:t>Restrained, precise, editorial</w:t>
       </w:r>
     </w:p>
@@ -236,7 +242,7 @@
       </w:pPr>
       <w:r>
         <w:rPr>
-          <w:rFonts w:ascii="EB Garamond" w:hAnsi="EB Garamond" w:eastAsia="Swei B2 Serif CJKtc"/>
+          <w:rFonts w:ascii="EB Garamond" w:hAnsi="EB Garamond" w:eastAsia="Swei B2 Serif CJKtc" w:cs="EB Garamond"/>
           <w:b w:val="0"/>
           <w:color w:val="525267"/>
           <w:sz w:val="25"/>
@@ -272,7 +278,7 @@
           <w:p>
             <w:r>
               <w:rPr>
-                <w:rFonts w:ascii="EB Garamond" w:hAnsi="EB Garamond" w:eastAsia="Swei B2 Serif CJKtc"/>
+                <w:rFonts w:ascii="EB Garamond" w:hAnsi="EB Garamond" w:eastAsia="Swei B2 Serif CJKtc" w:cs="EB Garamond"/>
                 <w:b/>
                 <w:color w:val="094197"/>
                 <w:sz w:val="18"/>
@@ -299,7 +305,7 @@
             </w:pPr>
             <w:r>
               <w:rPr>
-                <w:rFonts w:ascii="EB Garamond" w:hAnsi="EB Garamond" w:eastAsia="Swei B2 Serif CJKtc"/>
+                <w:rFonts w:ascii="EB Garamond" w:hAnsi="EB Garamond" w:eastAsia="Swei B2 Serif CJKtc" w:cs="EB Garamond"/>
                 <w:b/>
                 <w:color w:val="0A0A1E"/>
                 <w:sz w:val="24"/>
@@ -314,7 +320,7 @@
             </w:pPr>
             <w:r>
               <w:rPr>
-                <w:rFonts w:ascii="EB Garamond" w:hAnsi="EB Garamond" w:eastAsia="Swei B2 Serif CJKtc"/>
+                <w:rFonts w:ascii="EB Garamond" w:hAnsi="EB Garamond" w:eastAsia="Swei B2 Serif CJKtc" w:cs="EB Garamond"/>
                 <w:color w:val="525267"/>
                 <w:sz w:val="19"/>
               </w:rPr>
@@ -339,7 +345,7 @@
           <w:p>
             <w:r>
               <w:rPr>
-                <w:rFonts w:ascii="EB Garamond" w:hAnsi="EB Garamond" w:eastAsia="Swei B2 Serif CJKtc"/>
+                <w:rFonts w:ascii="EB Garamond" w:hAnsi="EB Garamond" w:eastAsia="Swei B2 Serif CJKtc" w:cs="EB Garamond"/>
                 <w:b/>
                 <w:color w:val="094197"/>
                 <w:sz w:val="18"/>
@@ -366,7 +372,7 @@
             </w:pPr>
             <w:r>
               <w:rPr>
-                <w:rFonts w:ascii="EB Garamond" w:hAnsi="EB Garamond" w:eastAsia="Swei B2 Serif CJKtc"/>
+                <w:rFonts w:ascii="EB Garamond" w:hAnsi="EB Garamond" w:eastAsia="Swei B2 Serif CJKtc" w:cs="EB Garamond"/>
                 <w:b/>
                 <w:color w:val="0A0A1E"/>
                 <w:sz w:val="24"/>
@@ -381,7 +387,7 @@
             </w:pPr>
             <w:r>
               <w:rPr>
-                <w:rFonts w:ascii="EB Garamond" w:hAnsi="EB Garamond" w:eastAsia="Swei B2 Serif CJKtc"/>
+                <w:rFonts w:ascii="EB Garamond" w:hAnsi="EB Garamond" w:eastAsia="Swei B2 Serif CJKtc" w:cs="EB Garamond"/>
                 <w:color w:val="525267"/>
                 <w:sz w:val="19"/>
               </w:rPr>
@@ -406,7 +412,7 @@
           <w:p>
             <w:r>
               <w:rPr>
-                <w:rFonts w:ascii="EB Garamond" w:hAnsi="EB Garamond" w:eastAsia="Swei B2 Serif CJKtc"/>
+                <w:rFonts w:ascii="EB Garamond" w:hAnsi="EB Garamond" w:eastAsia="Swei B2 Serif CJKtc" w:cs="EB Garamond"/>
                 <w:b/>
                 <w:color w:val="094197"/>
                 <w:sz w:val="18"/>
@@ -433,7 +439,7 @@
             </w:pPr>
             <w:r>
               <w:rPr>
-                <w:rFonts w:ascii="EB Garamond" w:hAnsi="EB Garamond" w:eastAsia="Swei B2 Serif CJKtc"/>
+                <w:rFonts w:ascii="EB Garamond" w:hAnsi="EB Garamond" w:eastAsia="Swei B2 Serif CJKtc" w:cs="EB Garamond"/>
                 <w:b/>
                 <w:color w:val="0A0A1E"/>
                 <w:sz w:val="24"/>
@@ -448,7 +454,7 @@
             </w:pPr>
             <w:r>
               <w:rPr>
-                <w:rFonts w:ascii="EB Garamond" w:hAnsi="EB Garamond" w:eastAsia="Swei B2 Serif CJKtc"/>
+                <w:rFonts w:ascii="EB Garamond" w:hAnsi="EB Garamond" w:eastAsia="Swei B2 Serif CJKtc" w:cs="EB Garamond"/>
                 <w:color w:val="525267"/>
                 <w:sz w:val="19"/>
               </w:rPr>
@@ -473,7 +479,7 @@
           <w:p>
             <w:r>
               <w:rPr>
-                <w:rFonts w:ascii="EB Garamond" w:hAnsi="EB Garamond" w:eastAsia="Swei B2 Serif CJKtc"/>
+                <w:rFonts w:ascii="EB Garamond" w:hAnsi="EB Garamond" w:eastAsia="Swei B2 Serif CJKtc" w:cs="EB Garamond"/>
                 <w:b/>
                 <w:color w:val="094197"/>
                 <w:sz w:val="18"/>
@@ -500,7 +506,7 @@
             </w:pPr>
             <w:r>
               <w:rPr>
-                <w:rFonts w:ascii="EB Garamond" w:hAnsi="EB Garamond" w:eastAsia="Swei B2 Serif CJKtc"/>
+                <w:rFonts w:ascii="EB Garamond" w:hAnsi="EB Garamond" w:eastAsia="Swei B2 Serif CJKtc" w:cs="EB Garamond"/>
                 <w:b/>
                 <w:color w:val="0A0A1E"/>
                 <w:sz w:val="24"/>
@@ -515,7 +521,7 @@
             </w:pPr>
             <w:r>
               <w:rPr>
-                <w:rFonts w:ascii="EB Garamond" w:hAnsi="EB Garamond" w:eastAsia="Swei B2 Serif CJKtc"/>
+                <w:rFonts w:ascii="EB Garamond" w:hAnsi="EB Garamond" w:eastAsia="Swei B2 Serif CJKtc" w:cs="EB Garamond"/>
                 <w:color w:val="525267"/>
                 <w:sz w:val="19"/>
               </w:rPr>
@@ -530,6 +536,12 @@
         <w:pStyle w:val="Heading2"/>
       </w:pPr>
       <w:r>
+        <w:rPr>
+          <w:rFonts w:ascii="EB Garamond" w:hAnsi="EB Garamond" w:eastAsia="Swei B2 Serif CJKtc" w:cs="EB Garamond"/>
+          <w:b/>
+          <w:color w:val="141539"/>
+          <w:sz w:val="30"/>
+        </w:rPr>
         <w:t>Color roles</w:t>
       </w:r>
     </w:p>
@@ -560,7 +572,7 @@
           <w:p>
             <w:r>
               <w:rPr>
-                <w:rFonts w:ascii="EB Garamond" w:hAnsi="EB Garamond" w:eastAsia="Swei B2 Serif CJKtc"/>
+                <w:rFonts w:ascii="EB Garamond" w:hAnsi="EB Garamond" w:eastAsia="Swei B2 Serif CJKtc" w:cs="EB Garamond"/>
                 <w:b/>
                 <w:color w:val="FFFFFF"/>
                 <w:sz w:val="18"/>
@@ -582,7 +594,7 @@
           <w:p>
             <w:r>
               <w:rPr>
-                <w:rFonts w:ascii="EB Garamond" w:hAnsi="EB Garamond" w:eastAsia="Swei B2 Serif CJKtc"/>
+                <w:rFonts w:ascii="EB Garamond" w:hAnsi="EB Garamond" w:eastAsia="Swei B2 Serif CJKtc" w:cs="EB Garamond"/>
                 <w:color w:val="0A0A1E"/>
                 <w:sz w:val="18"/>
               </w:rPr>
@@ -603,7 +615,7 @@
           <w:p>
             <w:r>
               <w:rPr>
-                <w:rFonts w:ascii="EB Garamond" w:hAnsi="EB Garamond" w:eastAsia="Swei B2 Serif CJKtc"/>
+                <w:rFonts w:ascii="EB Garamond" w:hAnsi="EB Garamond" w:eastAsia="Swei B2 Serif CJKtc" w:cs="EB Garamond"/>
                 <w:color w:val="525267"/>
                 <w:sz w:val="18"/>
               </w:rPr>
@@ -627,7 +639,7 @@
           <w:p>
             <w:r>
               <w:rPr>
-                <w:rFonts w:ascii="EB Garamond" w:hAnsi="EB Garamond" w:eastAsia="Swei B2 Serif CJKtc"/>
+                <w:rFonts w:ascii="EB Garamond" w:hAnsi="EB Garamond" w:eastAsia="Swei B2 Serif CJKtc" w:cs="EB Garamond"/>
                 <w:b/>
                 <w:color w:val="FFFFFF"/>
                 <w:sz w:val="18"/>
@@ -649,7 +661,7 @@
           <w:p>
             <w:r>
               <w:rPr>
-                <w:rFonts w:ascii="EB Garamond" w:hAnsi="EB Garamond" w:eastAsia="Swei B2 Serif CJKtc"/>
+                <w:rFonts w:ascii="EB Garamond" w:hAnsi="EB Garamond" w:eastAsia="Swei B2 Serif CJKtc" w:cs="EB Garamond"/>
                 <w:color w:val="0A0A1E"/>
                 <w:sz w:val="18"/>
               </w:rPr>
@@ -670,7 +682,7 @@
           <w:p>
             <w:r>
               <w:rPr>
-                <w:rFonts w:ascii="EB Garamond" w:hAnsi="EB Garamond" w:eastAsia="Swei B2 Serif CJKtc"/>
+                <w:rFonts w:ascii="EB Garamond" w:hAnsi="EB Garamond" w:eastAsia="Swei B2 Serif CJKtc" w:cs="EB Garamond"/>
                 <w:color w:val="525267"/>
                 <w:sz w:val="18"/>
               </w:rPr>
@@ -694,7 +706,7 @@
           <w:p>
             <w:r>
               <w:rPr>
-                <w:rFonts w:ascii="EB Garamond" w:hAnsi="EB Garamond" w:eastAsia="Swei B2 Serif CJKtc"/>
+                <w:rFonts w:ascii="EB Garamond" w:hAnsi="EB Garamond" w:eastAsia="Swei B2 Serif CJKtc" w:cs="EB Garamond"/>
                 <w:b/>
                 <w:color w:val="FFFFFF"/>
                 <w:sz w:val="18"/>
@@ -716,7 +728,7 @@
           <w:p>
             <w:r>
               <w:rPr>
-                <w:rFonts w:ascii="EB Garamond" w:hAnsi="EB Garamond" w:eastAsia="Swei B2 Serif CJKtc"/>
+                <w:rFonts w:ascii="EB Garamond" w:hAnsi="EB Garamond" w:eastAsia="Swei B2 Serif CJKtc" w:cs="EB Garamond"/>
                 <w:color w:val="0A0A1E"/>
                 <w:sz w:val="18"/>
               </w:rPr>
@@ -737,7 +749,7 @@
           <w:p>
             <w:r>
               <w:rPr>
-                <w:rFonts w:ascii="EB Garamond" w:hAnsi="EB Garamond" w:eastAsia="Swei B2 Serif CJKtc"/>
+                <w:rFonts w:ascii="EB Garamond" w:hAnsi="EB Garamond" w:eastAsia="Swei B2 Serif CJKtc" w:cs="EB Garamond"/>
                 <w:color w:val="525267"/>
                 <w:sz w:val="18"/>
               </w:rPr>
@@ -761,7 +773,7 @@
           <w:p>
             <w:r>
               <w:rPr>
-                <w:rFonts w:ascii="EB Garamond" w:hAnsi="EB Garamond" w:eastAsia="Swei B2 Serif CJKtc"/>
+                <w:rFonts w:ascii="EB Garamond" w:hAnsi="EB Garamond" w:eastAsia="Swei B2 Serif CJKtc" w:cs="EB Garamond"/>
                 <w:b/>
                 <w:color w:val="FFFFFF"/>
                 <w:sz w:val="18"/>
@@ -783,7 +795,7 @@
           <w:p>
             <w:r>
               <w:rPr>
-                <w:rFonts w:ascii="EB Garamond" w:hAnsi="EB Garamond" w:eastAsia="Swei B2 Serif CJKtc"/>
+                <w:rFonts w:ascii="EB Garamond" w:hAnsi="EB Garamond" w:eastAsia="Swei B2 Serif CJKtc" w:cs="EB Garamond"/>
                 <w:color w:val="0A0A1E"/>
                 <w:sz w:val="18"/>
               </w:rPr>
@@ -804,7 +816,7 @@
           <w:p>
             <w:r>
               <w:rPr>
-                <w:rFonts w:ascii="EB Garamond" w:hAnsi="EB Garamond" w:eastAsia="Swei B2 Serif CJKtc"/>
+                <w:rFonts w:ascii="EB Garamond" w:hAnsi="EB Garamond" w:eastAsia="Swei B2 Serif CJKtc" w:cs="EB Garamond"/>
                 <w:color w:val="525267"/>
                 <w:sz w:val="18"/>
               </w:rPr>
@@ -828,7 +840,7 @@
           <w:p>
             <w:r>
               <w:rPr>
-                <w:rFonts w:ascii="EB Garamond" w:hAnsi="EB Garamond" w:eastAsia="Swei B2 Serif CJKtc"/>
+                <w:rFonts w:ascii="EB Garamond" w:hAnsi="EB Garamond" w:eastAsia="Swei B2 Serif CJKtc" w:cs="EB Garamond"/>
                 <w:b/>
                 <w:color w:val="0A0A1E"/>
                 <w:sz w:val="18"/>
@@ -850,7 +862,7 @@
           <w:p>
             <w:r>
               <w:rPr>
-                <w:rFonts w:ascii="EB Garamond" w:hAnsi="EB Garamond" w:eastAsia="Swei B2 Serif CJKtc"/>
+                <w:rFonts w:ascii="EB Garamond" w:hAnsi="EB Garamond" w:eastAsia="Swei B2 Serif CJKtc" w:cs="EB Garamond"/>
                 <w:color w:val="0A0A1E"/>
                 <w:sz w:val="18"/>
               </w:rPr>
@@ -871,7 +883,7 @@
           <w:p>
             <w:r>
               <w:rPr>
-                <w:rFonts w:ascii="EB Garamond" w:hAnsi="EB Garamond" w:eastAsia="Swei B2 Serif CJKtc"/>
+                <w:rFonts w:ascii="EB Garamond" w:hAnsi="EB Garamond" w:eastAsia="Swei B2 Serif CJKtc" w:cs="EB Garamond"/>
                 <w:color w:val="525267"/>
                 <w:sz w:val="18"/>
               </w:rPr>
@@ -895,7 +907,7 @@
           <w:p>
             <w:r>
               <w:rPr>
-                <w:rFonts w:ascii="EB Garamond" w:hAnsi="EB Garamond" w:eastAsia="Swei B2 Serif CJKtc"/>
+                <w:rFonts w:ascii="EB Garamond" w:hAnsi="EB Garamond" w:eastAsia="Swei B2 Serif CJKtc" w:cs="EB Garamond"/>
                 <w:b/>
                 <w:color w:val="0A0A1E"/>
                 <w:sz w:val="18"/>
@@ -917,7 +929,7 @@
           <w:p>
             <w:r>
               <w:rPr>
-                <w:rFonts w:ascii="EB Garamond" w:hAnsi="EB Garamond" w:eastAsia="Swei B2 Serif CJKtc"/>
+                <w:rFonts w:ascii="EB Garamond" w:hAnsi="EB Garamond" w:eastAsia="Swei B2 Serif CJKtc" w:cs="EB Garamond"/>
                 <w:color w:val="0A0A1E"/>
                 <w:sz w:val="18"/>
               </w:rPr>
@@ -938,7 +950,7 @@
           <w:p>
             <w:r>
               <w:rPr>
-                <w:rFonts w:ascii="EB Garamond" w:hAnsi="EB Garamond" w:eastAsia="Swei B2 Serif CJKtc"/>
+                <w:rFonts w:ascii="EB Garamond" w:hAnsi="EB Garamond" w:eastAsia="Swei B2 Serif CJKtc" w:cs="EB Garamond"/>
                 <w:color w:val="525267"/>
                 <w:sz w:val="18"/>
               </w:rPr>
@@ -1001,7 +1013,7 @@
       </w:pPr>
       <w:r>
         <w:rPr>
-          <w:rFonts w:ascii="EB Garamond" w:hAnsi="EB Garamond" w:eastAsia="Swei B2 Serif CJKtc"/>
+          <w:rFonts w:ascii="EB Garamond" w:hAnsi="EB Garamond" w:eastAsia="Swei B2 Serif CJKtc" w:cs="EB Garamond"/>
           <w:b/>
           <w:color w:val="404082"/>
           <w:sz w:val="17"/>
@@ -1014,6 +1026,12 @@
         <w:pStyle w:val="Heading1"/>
       </w:pPr>
       <w:r>
+        <w:rPr>
+          <w:rFonts w:ascii="EB Garamond" w:hAnsi="EB Garamond" w:eastAsia="Swei B2 Serif CJKtc" w:cs="EB Garamond"/>
+          <w:b/>
+          <w:color w:val="0A0A1E"/>
+          <w:sz w:val="44"/>
+        </w:rPr>
         <w:t>One system, four expressions</w:t>
       </w:r>
     </w:p>
@@ -1024,7 +1042,7 @@
       </w:pPr>
       <w:r>
         <w:rPr>
-          <w:rFonts w:ascii="EB Garamond" w:hAnsi="EB Garamond" w:eastAsia="Swei B2 Serif CJKtc"/>
+          <w:rFonts w:ascii="EB Garamond" w:hAnsi="EB Garamond" w:eastAsia="Swei B2 Serif CJKtc" w:cs="EB Garamond"/>
           <w:b w:val="0"/>
           <w:color w:val="525267"/>
           <w:sz w:val="25"/>
@@ -1039,7 +1057,7 @@
       </w:pPr>
       <w:r>
         <w:rPr>
-          <w:rFonts w:ascii="EB Garamond" w:hAnsi="EB Garamond" w:eastAsia="Swei B2 Serif CJKtc"/>
+          <w:rFonts w:ascii="EB Garamond" w:hAnsi="EB Garamond" w:eastAsia="Swei B2 Serif CJKtc" w:cs="EB Garamond"/>
           <w:b/>
           <w:color w:val="0A0A1E"/>
           <w:sz w:val="34"/>
@@ -1048,7 +1066,7 @@
       </w:r>
       <w:r>
         <w:rPr>
-          <w:rFonts w:ascii="EB Garamond" w:hAnsi="EB Garamond" w:eastAsia="Swei B2 Serif CJKtc"/>
+          <w:rFonts w:ascii="EB Garamond" w:hAnsi="EB Garamond" w:eastAsia="Swei B2 Serif CJKtc" w:cs="EB Garamond"/>
           <w:b/>
           <w:color w:val="094197"/>
           <w:sz w:val="19"/>
@@ -1063,7 +1081,7 @@
       </w:pPr>
       <w:r>
         <w:rPr>
-          <w:rFonts w:ascii="EB Garamond" w:hAnsi="EB Garamond" w:eastAsia="Swei B2 Serif CJKtc"/>
+          <w:rFonts w:ascii="EB Garamond" w:hAnsi="EB Garamond" w:eastAsia="Swei B2 Serif CJKtc" w:cs="EB Garamond"/>
           <w:b w:val="0"/>
           <w:color w:val="525267"/>
           <w:sz w:val="20"/>
@@ -1078,7 +1096,7 @@
       </w:pPr>
       <w:r>
         <w:rPr>
-          <w:rFonts w:ascii="EB Garamond" w:hAnsi="EB Garamond" w:eastAsia="Swei B2 Serif CJKtc"/>
+          <w:rFonts w:ascii="EB Garamond" w:hAnsi="EB Garamond" w:eastAsia="Swei B2 Serif CJKtc" w:cs="EB Garamond"/>
           <w:b/>
           <w:color w:val="0A0A1E"/>
           <w:sz w:val="34"/>
@@ -1087,7 +1105,7 @@
       </w:r>
       <w:r>
         <w:rPr>
-          <w:rFonts w:ascii="EB Garamond" w:hAnsi="EB Garamond" w:eastAsia="Swei B2 Serif CJKtc"/>
+          <w:rFonts w:ascii="EB Garamond" w:hAnsi="EB Garamond" w:eastAsia="Swei B2 Serif CJKtc" w:cs="EB Garamond"/>
           <w:b/>
           <w:color w:val="094197"/>
           <w:sz w:val="19"/>
@@ -1102,7 +1120,7 @@
       </w:pPr>
       <w:r>
         <w:rPr>
-          <w:rFonts w:ascii="EB Garamond" w:hAnsi="EB Garamond" w:eastAsia="Swei B2 Serif CJKtc"/>
+          <w:rFonts w:ascii="EB Garamond" w:hAnsi="EB Garamond" w:eastAsia="Swei B2 Serif CJKtc" w:cs="EB Garamond"/>
           <w:b w:val="0"/>
           <w:color w:val="525267"/>
           <w:sz w:val="20"/>
@@ -1117,7 +1135,7 @@
       </w:pPr>
       <w:r>
         <w:rPr>
-          <w:rFonts w:ascii="EB Garamond" w:hAnsi="EB Garamond" w:eastAsia="Swei B2 Serif CJKtc"/>
+          <w:rFonts w:ascii="EB Garamond" w:hAnsi="EB Garamond" w:eastAsia="Swei B2 Serif CJKtc" w:cs="EB Garamond"/>
           <w:b/>
           <w:color w:val="0A0A1E"/>
           <w:sz w:val="34"/>
@@ -1126,7 +1144,7 @@
       </w:r>
       <w:r>
         <w:rPr>
-          <w:rFonts w:ascii="EB Garamond" w:hAnsi="EB Garamond" w:eastAsia="Swei B2 Serif CJKtc"/>
+          <w:rFonts w:ascii="EB Garamond" w:hAnsi="EB Garamond" w:eastAsia="Swei B2 Serif CJKtc" w:cs="EB Garamond"/>
           <w:b/>
           <w:color w:val="094197"/>
           <w:sz w:val="19"/>
@@ -1141,7 +1159,7 @@
       </w:pPr>
       <w:r>
         <w:rPr>
-          <w:rFonts w:ascii="EB Garamond" w:hAnsi="EB Garamond" w:eastAsia="Swei B2 Serif CJKtc"/>
+          <w:rFonts w:ascii="EB Garamond" w:hAnsi="EB Garamond" w:eastAsia="Swei B2 Serif CJKtc" w:cs="EB Garamond"/>
           <w:b w:val="0"/>
           <w:color w:val="525267"/>
           <w:sz w:val="20"/>
@@ -1156,7 +1174,7 @@
       </w:pPr>
       <w:r>
         <w:rPr>
-          <w:rFonts w:ascii="EB Garamond" w:hAnsi="EB Garamond" w:eastAsia="Swei B2 Serif CJKtc"/>
+          <w:rFonts w:ascii="EB Garamond" w:hAnsi="EB Garamond" w:eastAsia="Swei B2 Serif CJKtc" w:cs="EB Garamond"/>
           <w:b/>
           <w:color w:val="0A0A1E"/>
           <w:sz w:val="34"/>
@@ -1165,7 +1183,7 @@
       </w:r>
       <w:r>
         <w:rPr>
-          <w:rFonts w:ascii="EB Garamond" w:hAnsi="EB Garamond" w:eastAsia="Swei B2 Serif CJKtc"/>
+          <w:rFonts w:ascii="EB Garamond" w:hAnsi="EB Garamond" w:eastAsia="Swei B2 Serif CJKtc" w:cs="EB Garamond"/>
           <w:b/>
           <w:color w:val="094197"/>
           <w:sz w:val="19"/>
@@ -1180,7 +1198,7 @@
       </w:pPr>
       <w:r>
         <w:rPr>
-          <w:rFonts w:ascii="EB Garamond" w:hAnsi="EB Garamond" w:eastAsia="Swei B2 Serif CJKtc"/>
+          <w:rFonts w:ascii="EB Garamond" w:hAnsi="EB Garamond" w:eastAsia="Swei B2 Serif CJKtc" w:cs="EB Garamond"/>
           <w:b w:val="0"/>
           <w:color w:val="525267"/>
           <w:sz w:val="20"/>
@@ -1193,6 +1211,12 @@
         <w:pStyle w:val="Heading2"/>
       </w:pPr>
       <w:r>
+        <w:rPr>
+          <w:rFonts w:ascii="EB Garamond" w:hAnsi="EB Garamond" w:eastAsia="Swei B2 Serif CJKtc" w:cs="EB Garamond"/>
+          <w:b/>
+          <w:color w:val="141539"/>
+          <w:sz w:val="30"/>
+        </w:rPr>
         <w:t>Natural-language input</w:t>
       </w:r>
     </w:p>
@@ -1221,7 +1245,7 @@
           <w:p>
             <w:r>
               <w:rPr>
-                <w:rFonts w:ascii="EB Garamond" w:hAnsi="EB Garamond" w:eastAsia="Swei B2 Serif CJKtc"/>
+                <w:rFonts w:ascii="EB Garamond" w:hAnsi="EB Garamond" w:eastAsia="Swei B2 Serif CJKtc" w:cs="EB Garamond"/>
                 <w:b/>
                 <w:color w:val="FFFFFF"/>
                 <w:sz w:val="24"/>
@@ -1236,7 +1260,7 @@
             </w:pPr>
             <w:r>
               <w:rPr>
-                <w:rFonts w:ascii="EB Garamond" w:hAnsi="EB Garamond" w:eastAsia="Swei B2 Serif CJKtc"/>
+                <w:rFonts w:ascii="EB Garamond" w:hAnsi="EB Garamond" w:eastAsia="Swei B2 Serif CJKtc" w:cs="EB Garamond"/>
                 <w:color w:val="D8D8E2"/>
                 <w:sz w:val="19"/>
               </w:rPr>
@@ -1299,7 +1323,7 @@
       </w:pPr>
       <w:r>
         <w:rPr>
-          <w:rFonts w:ascii="EB Garamond" w:hAnsi="EB Garamond" w:eastAsia="Swei B2 Serif CJKtc"/>
+          <w:rFonts w:ascii="EB Garamond" w:hAnsi="EB Garamond" w:eastAsia="Swei B2 Serif CJKtc" w:cs="EB Garamond"/>
           <w:b/>
           <w:color w:val="404082"/>
           <w:sz w:val="17"/>
@@ -1312,6 +1336,12 @@
         <w:pStyle w:val="Heading1"/>
       </w:pPr>
       <w:r>
+        <w:rPr>
+          <w:rFonts w:ascii="EB Garamond" w:hAnsi="EB Garamond" w:eastAsia="Swei B2 Serif CJKtc" w:cs="EB Garamond"/>
+          <w:b/>
+          <w:color w:val="0A0A1E"/>
+          <w:sz w:val="44"/>
+        </w:rPr>
         <w:t>From client material to multi-format delivery</w:t>
       </w:r>
     </w:p>
@@ -1342,7 +1372,7 @@
           <w:p>
             <w:r>
               <w:rPr>
-                <w:rFonts w:ascii="EB Garamond" w:hAnsi="EB Garamond" w:eastAsia="Swei B2 Serif CJKtc"/>
+                <w:rFonts w:ascii="EB Garamond" w:hAnsi="EB Garamond" w:eastAsia="Swei B2 Serif CJKtc" w:cs="EB Garamond"/>
                 <w:b/>
                 <w:color w:val="FFFFFF"/>
                 <w:sz w:val="19"/>
@@ -1368,7 +1398,7 @@
             </w:pPr>
             <w:r>
               <w:rPr>
-                <w:rFonts w:ascii="EB Garamond" w:hAnsi="EB Garamond" w:eastAsia="Swei B2 Serif CJKtc"/>
+                <w:rFonts w:ascii="EB Garamond" w:hAnsi="EB Garamond" w:eastAsia="Swei B2 Serif CJKtc" w:cs="EB Garamond"/>
                 <w:b/>
                 <w:color w:val="0A0A1E"/>
                 <w:sz w:val="23"/>
@@ -1383,7 +1413,7 @@
             </w:pPr>
             <w:r>
               <w:rPr>
-                <w:rFonts w:ascii="EB Garamond" w:hAnsi="EB Garamond" w:eastAsia="Swei B2 Serif CJKtc"/>
+                <w:rFonts w:ascii="EB Garamond" w:hAnsi="EB Garamond" w:eastAsia="Swei B2 Serif CJKtc" w:cs="EB Garamond"/>
                 <w:color w:val="525267"/>
                 <w:sz w:val="19"/>
               </w:rPr>
@@ -1400,7 +1430,7 @@
       </w:pPr>
       <w:r>
         <w:rPr>
-          <w:rFonts w:ascii="EB Garamond" w:hAnsi="EB Garamond" w:eastAsia="Swei B2 Serif CJKtc"/>
+          <w:rFonts w:ascii="EB Garamond" w:hAnsi="EB Garamond" w:eastAsia="Swei B2 Serif CJKtc" w:cs="EB Garamond"/>
           <w:b w:val="0"/>
           <w:color w:val="0A0A1E"/>
           <w:sz w:val="21"/>
@@ -1434,7 +1464,7 @@
           <w:p>
             <w:r>
               <w:rPr>
-                <w:rFonts w:ascii="EB Garamond" w:hAnsi="EB Garamond" w:eastAsia="Swei B2 Serif CJKtc"/>
+                <w:rFonts w:ascii="EB Garamond" w:hAnsi="EB Garamond" w:eastAsia="Swei B2 Serif CJKtc" w:cs="EB Garamond"/>
                 <w:b/>
                 <w:color w:val="FFFFFF"/>
                 <w:sz w:val="19"/>
@@ -1460,7 +1490,7 @@
             </w:pPr>
             <w:r>
               <w:rPr>
-                <w:rFonts w:ascii="EB Garamond" w:hAnsi="EB Garamond" w:eastAsia="Swei B2 Serif CJKtc"/>
+                <w:rFonts w:ascii="EB Garamond" w:hAnsi="EB Garamond" w:eastAsia="Swei B2 Serif CJKtc" w:cs="EB Garamond"/>
                 <w:b/>
                 <w:color w:val="0A0A1E"/>
                 <w:sz w:val="23"/>
@@ -1475,7 +1505,7 @@
             </w:pPr>
             <w:r>
               <w:rPr>
-                <w:rFonts w:ascii="EB Garamond" w:hAnsi="EB Garamond" w:eastAsia="Swei B2 Serif CJKtc"/>
+                <w:rFonts w:ascii="EB Garamond" w:hAnsi="EB Garamond" w:eastAsia="Swei B2 Serif CJKtc" w:cs="EB Garamond"/>
                 <w:color w:val="525267"/>
                 <w:sz w:val="19"/>
               </w:rPr>
@@ -1492,7 +1522,7 @@
       </w:pPr>
       <w:r>
         <w:rPr>
-          <w:rFonts w:ascii="EB Garamond" w:hAnsi="EB Garamond" w:eastAsia="Swei B2 Serif CJKtc"/>
+          <w:rFonts w:ascii="EB Garamond" w:hAnsi="EB Garamond" w:eastAsia="Swei B2 Serif CJKtc" w:cs="EB Garamond"/>
           <w:b w:val="0"/>
           <w:color w:val="0A0A1E"/>
           <w:sz w:val="21"/>
@@ -1526,7 +1556,7 @@
           <w:p>
             <w:r>
               <w:rPr>
-                <w:rFonts w:ascii="EB Garamond" w:hAnsi="EB Garamond" w:eastAsia="Swei B2 Serif CJKtc"/>
+                <w:rFonts w:ascii="EB Garamond" w:hAnsi="EB Garamond" w:eastAsia="Swei B2 Serif CJKtc" w:cs="EB Garamond"/>
                 <w:b/>
                 <w:color w:val="FFFFFF"/>
                 <w:sz w:val="19"/>
@@ -1552,7 +1582,7 @@
             </w:pPr>
             <w:r>
               <w:rPr>
-                <w:rFonts w:ascii="EB Garamond" w:hAnsi="EB Garamond" w:eastAsia="Swei B2 Serif CJKtc"/>
+                <w:rFonts w:ascii="EB Garamond" w:hAnsi="EB Garamond" w:eastAsia="Swei B2 Serif CJKtc" w:cs="EB Garamond"/>
                 <w:b/>
                 <w:color w:val="0A0A1E"/>
                 <w:sz w:val="23"/>
@@ -1567,7 +1597,7 @@
             </w:pPr>
             <w:r>
               <w:rPr>
-                <w:rFonts w:ascii="EB Garamond" w:hAnsi="EB Garamond" w:eastAsia="Swei B2 Serif CJKtc"/>
+                <w:rFonts w:ascii="EB Garamond" w:hAnsi="EB Garamond" w:eastAsia="Swei B2 Serif CJKtc" w:cs="EB Garamond"/>
                 <w:color w:val="525267"/>
                 <w:sz w:val="19"/>
               </w:rPr>
@@ -1584,7 +1614,7 @@
       </w:pPr>
       <w:r>
         <w:rPr>
-          <w:rFonts w:ascii="EB Garamond" w:hAnsi="EB Garamond" w:eastAsia="Swei B2 Serif CJKtc"/>
+          <w:rFonts w:ascii="EB Garamond" w:hAnsi="EB Garamond" w:eastAsia="Swei B2 Serif CJKtc" w:cs="EB Garamond"/>
           <w:b w:val="0"/>
           <w:color w:val="0A0A1E"/>
           <w:sz w:val="21"/>
@@ -1618,7 +1648,7 @@
           <w:p>
             <w:r>
               <w:rPr>
-                <w:rFonts w:ascii="EB Garamond" w:hAnsi="EB Garamond" w:eastAsia="Swei B2 Serif CJKtc"/>
+                <w:rFonts w:ascii="EB Garamond" w:hAnsi="EB Garamond" w:eastAsia="Swei B2 Serif CJKtc" w:cs="EB Garamond"/>
                 <w:b/>
                 <w:color w:val="FFFFFF"/>
                 <w:sz w:val="19"/>
@@ -1644,7 +1674,7 @@
             </w:pPr>
             <w:r>
               <w:rPr>
-                <w:rFonts w:ascii="EB Garamond" w:hAnsi="EB Garamond" w:eastAsia="Swei B2 Serif CJKtc"/>
+                <w:rFonts w:ascii="EB Garamond" w:hAnsi="EB Garamond" w:eastAsia="Swei B2 Serif CJKtc" w:cs="EB Garamond"/>
                 <w:b/>
                 <w:color w:val="0A0A1E"/>
                 <w:sz w:val="23"/>
@@ -1659,7 +1689,7 @@
             </w:pPr>
             <w:r>
               <w:rPr>
-                <w:rFonts w:ascii="EB Garamond" w:hAnsi="EB Garamond" w:eastAsia="Swei B2 Serif CJKtc"/>
+                <w:rFonts w:ascii="EB Garamond" w:hAnsi="EB Garamond" w:eastAsia="Swei B2 Serif CJKtc" w:cs="EB Garamond"/>
                 <w:color w:val="525267"/>
                 <w:sz w:val="19"/>
               </w:rPr>
@@ -1676,7 +1706,7 @@
       </w:pPr>
       <w:r>
         <w:rPr>
-          <w:rFonts w:ascii="EB Garamond" w:hAnsi="EB Garamond" w:eastAsia="Swei B2 Serif CJKtc"/>
+          <w:rFonts w:ascii="EB Garamond" w:hAnsi="EB Garamond" w:eastAsia="Swei B2 Serif CJKtc" w:cs="EB Garamond"/>
           <w:b w:val="0"/>
           <w:color w:val="0A0A1E"/>
           <w:sz w:val="21"/>
@@ -1710,7 +1740,7 @@
           <w:p>
             <w:r>
               <w:rPr>
-                <w:rFonts w:ascii="EB Garamond" w:hAnsi="EB Garamond" w:eastAsia="Swei B2 Serif CJKtc"/>
+                <w:rFonts w:ascii="EB Garamond" w:hAnsi="EB Garamond" w:eastAsia="Swei B2 Serif CJKtc" w:cs="EB Garamond"/>
                 <w:b/>
                 <w:color w:val="FFFFFF"/>
                 <w:sz w:val="19"/>
@@ -1736,7 +1766,7 @@
             </w:pPr>
             <w:r>
               <w:rPr>
-                <w:rFonts w:ascii="EB Garamond" w:hAnsi="EB Garamond" w:eastAsia="Swei B2 Serif CJKtc"/>
+                <w:rFonts w:ascii="EB Garamond" w:hAnsi="EB Garamond" w:eastAsia="Swei B2 Serif CJKtc" w:cs="EB Garamond"/>
                 <w:b/>
                 <w:color w:val="0A0A1E"/>
                 <w:sz w:val="23"/>
@@ -1751,7 +1781,7 @@
             </w:pPr>
             <w:r>
               <w:rPr>
-                <w:rFonts w:ascii="EB Garamond" w:hAnsi="EB Garamond" w:eastAsia="Swei B2 Serif CJKtc"/>
+                <w:rFonts w:ascii="EB Garamond" w:hAnsi="EB Garamond" w:eastAsia="Swei B2 Serif CJKtc" w:cs="EB Garamond"/>
                 <w:color w:val="525267"/>
                 <w:sz w:val="19"/>
               </w:rPr>
@@ -1768,7 +1798,7 @@
       </w:pPr>
       <w:r>
         <w:rPr>
-          <w:rFonts w:ascii="EB Garamond" w:hAnsi="EB Garamond" w:eastAsia="Swei B2 Serif CJKtc"/>
+          <w:rFonts w:ascii="EB Garamond" w:hAnsi="EB Garamond" w:eastAsia="Swei B2 Serif CJKtc" w:cs="EB Garamond"/>
           <w:b w:val="0"/>
           <w:color w:val="0A0A1E"/>
           <w:sz w:val="21"/>
@@ -1780,6 +1810,12 @@
         <w:pStyle w:val="Heading2"/>
       </w:pPr>
       <w:r>
+        <w:rPr>
+          <w:rFonts w:ascii="EB Garamond" w:hAnsi="EB Garamond" w:eastAsia="Swei B2 Serif CJKtc" w:cs="EB Garamond"/>
+          <w:b/>
+          <w:color w:val="141539"/>
+          <w:sz w:val="30"/>
+        </w:rPr>
         <w:t>Quality floor</w:t>
       </w:r>
     </w:p>
@@ -1791,7 +1827,7 @@
       </w:pPr>
       <w:r>
         <w:rPr>
-          <w:rFonts w:ascii="EB Garamond" w:hAnsi="EB Garamond" w:eastAsia="Swei B2 Serif CJKtc"/>
+          <w:rFonts w:ascii="EB Garamond" w:hAnsi="EB Garamond" w:eastAsia="Swei B2 Serif CJKtc" w:cs="EB Garamond"/>
           <w:color w:val="0A0A1E"/>
           <w:sz w:val="20"/>
         </w:rPr>
@@ -1806,7 +1842,7 @@
       </w:pPr>
       <w:r>
         <w:rPr>
-          <w:rFonts w:ascii="EB Garamond" w:hAnsi="EB Garamond" w:eastAsia="Swei B2 Serif CJKtc"/>
+          <w:rFonts w:ascii="EB Garamond" w:hAnsi="EB Garamond" w:eastAsia="Swei B2 Serif CJKtc" w:cs="EB Garamond"/>
           <w:color w:val="0A0A1E"/>
           <w:sz w:val="20"/>
         </w:rPr>
@@ -1821,7 +1857,7 @@
       </w:pPr>
       <w:r>
         <w:rPr>
-          <w:rFonts w:ascii="EB Garamond" w:hAnsi="EB Garamond" w:eastAsia="Swei B2 Serif CJKtc"/>
+          <w:rFonts w:ascii="EB Garamond" w:hAnsi="EB Garamond" w:eastAsia="Swei B2 Serif CJKtc" w:cs="EB Garamond"/>
           <w:color w:val="0A0A1E"/>
           <w:sz w:val="20"/>
         </w:rPr>
@@ -1836,7 +1872,7 @@
       </w:pPr>
       <w:r>
         <w:rPr>
-          <w:rFonts w:ascii="EB Garamond" w:hAnsi="EB Garamond" w:eastAsia="Swei B2 Serif CJKtc"/>
+          <w:rFonts w:ascii="EB Garamond" w:hAnsi="EB Garamond" w:eastAsia="Swei B2 Serif CJKtc" w:cs="EB Garamond"/>
           <w:color w:val="0A0A1E"/>
           <w:sz w:val="20"/>
         </w:rPr>
@@ -1850,7 +1886,7 @@
       </w:pPr>
       <w:r>
         <w:rPr>
-          <w:rFonts w:ascii="EB Garamond" w:hAnsi="EB Garamond" w:eastAsia="Swei B2 Serif CJKtc"/>
+          <w:rFonts w:ascii="EB Garamond" w:hAnsi="EB Garamond" w:eastAsia="Swei B2 Serif CJKtc" w:cs="EB Garamond"/>
           <w:b/>
           <w:color w:val="094197"/>
           <w:sz w:val="17"/>
@@ -1865,7 +1901,7 @@
       </w:pPr>
       <w:r>
         <w:rPr>
-          <w:rFonts w:ascii="EB Garamond" w:hAnsi="EB Garamond" w:eastAsia="Swei B2 Serif CJKtc"/>
+          <w:rFonts w:ascii="EB Garamond" w:hAnsi="EB Garamond" w:eastAsia="Swei B2 Serif CJKtc" w:cs="EB Garamond"/>
           <w:b/>
           <w:color w:val="0A0A1E"/>
           <w:sz w:val="28"/>
@@ -1896,7 +1932,7 @@
     </w:pPr>
     <w:r>
       <w:rPr>
-        <w:rFonts w:ascii="EB Garamond" w:hAnsi="EB Garamond" w:eastAsia="Swei B2 Serif CJKtc"/>
+        <w:rFonts w:ascii="EB Garamond" w:hAnsi="EB Garamond" w:eastAsia="Swei B2 Serif CJKtc" w:cs="EB Garamond"/>
         <w:color w:val="525267"/>
         <w:sz w:val="17"/>
       </w:rPr>
@@ -2297,7 +2333,7 @@
       <w:spacing w:after="160" w:line="324" w:lineRule="auto"/>
     </w:pPr>
     <w:rPr>
-      <w:rFonts w:ascii="EB Garamond" w:hAnsi="EB Garamond" w:eastAsia="Swei B2 Serif CJKtc"/>
+      <w:rFonts w:ascii="EB Garamond" w:hAnsi="EB Garamond" w:eastAsia="Swei B2 Serif CJKtc" w:cs="EB Garamond"/>
       <w:color w:val="0A0A1E"/>
       <w:sz w:val="21"/>
     </w:rPr>
@@ -2361,7 +2397,7 @@
       <w:outlineLvl w:val="0"/>
     </w:pPr>
     <w:rPr>
-      <w:rFonts w:asciiTheme="majorHAnsi" w:eastAsiaTheme="majorEastAsia" w:hAnsiTheme="majorHAnsi" w:cstheme="majorBidi" w:ascii="EB Garamond" w:hAnsi="EB Garamond" w:eastAsia="Swei B2 Serif CJKtc"/>
+      <w:rFonts w:ascii="EB Garamond" w:hAnsi="EB Garamond" w:eastAsia="Swei B2 Serif CJKtc" w:cs="EB Garamond"/>
       <w:b/>
       <w:bCs/>
       <w:color w:val="0A0A1E"/>
@@ -2385,7 +2421,7 @@
       <w:outlineLvl w:val="1"/>
     </w:pPr>
     <w:rPr>
-      <w:rFonts w:asciiTheme="majorHAnsi" w:eastAsiaTheme="majorEastAsia" w:hAnsiTheme="majorHAnsi" w:cstheme="majorBidi" w:ascii="EB Garamond" w:hAnsi="EB Garamond" w:eastAsia="Swei B2 Serif CJKtc"/>
+      <w:rFonts w:ascii="EB Garamond" w:hAnsi="EB Garamond" w:eastAsia="Swei B2 Serif CJKtc" w:cs="EB Garamond"/>
       <w:b/>
       <w:bCs/>
       <w:color w:val="141539"/>
@@ -2409,7 +2445,7 @@
       <w:outlineLvl w:val="2"/>
     </w:pPr>
     <w:rPr>
-      <w:rFonts w:asciiTheme="majorHAnsi" w:eastAsiaTheme="majorEastAsia" w:hAnsiTheme="majorHAnsi" w:cstheme="majorBidi" w:ascii="EB Garamond" w:hAnsi="EB Garamond" w:eastAsia="Swei B2 Serif CJKtc"/>
+      <w:rFonts w:ascii="EB Garamond" w:hAnsi="EB Garamond" w:eastAsia="Swei B2 Serif CJKtc" w:cs="EB Garamond"/>
       <w:b/>
       <w:bCs/>
       <w:color w:val="094197"/>

</xml_diff>